<commit_message>
Add static UK ingredient data, offline fast-exit, and accurate per-portion kcal/cost rendering across all 26 recipe cards
Co-authored-by: pullent96 <270024506+pullent96@users.noreply.github.com>
Agent-Logs-Url: https://github.com/pullent96/card-yield-kcal-cost-engine/sessions/dcc31501-dc7f-44fb-9cff-c110873ed03e
</commit_message>
<xml_diff>
--- a/output/rendered/Chicken_Traybake.docx
+++ b/output/rendered/Chicken_Traybake.docx
@@ -170,7 +170,7 @@
     </w:p>
     <w:p>
       <w:r>
-        <w:t>TODO: [kcal could not be researched — no data]</w:t>
+        <w:t>~170 kcal per portion (1698 kcal total for 10 portions, estimated)</w:t>
       </w:r>
     </w:p>
     <w:p>
@@ -184,7 +184,7 @@
     </w:p>
     <w:p>
       <w:r>
-        <w:t>TODO: [cost could not be researched — no data]</w:t>
+        <w:t>£2.45–£3.87 total | £0.25–£0.39 per portion (estimated from UK supermarket data, 10 portions)</w:t>
       </w:r>
     </w:p>
     <w:p>

</xml_diff>